<commit_message>
add Delete button to the shopping list
</commit_message>
<xml_diff>
--- a/import PageTemplate from.docx
+++ b/import PageTemplate from.docx
@@ -64,7 +64,6 @@
         <w:t xml:space="preserve">  const navigate = useNavigate();</w:t>
       </w:r>
     </w:p>
-    <w:p/>
     <w:p>
       <w:r>
         <w:t xml:space="preserve">  const [search, setSearch] = useState("");</w:t>
@@ -73,7 +72,7 @@
     <w:p/>
     <w:p>
       <w:r>
-        <w:t xml:space="preserve">  const [products, setProducts] = useState&lt;Product[]&gt;([</w:t>
+        <w:t xml:space="preserve">  const [products] = useState&lt;Product[]&gt;([</w:t>
       </w:r>
     </w:p>
     <w:p>
@@ -98,7 +97,7 @@
     </w:p>
     <w:p>
       <w:r>
-        <w:t xml:space="preserve">      picture: "https://via.placeholder.com/100?text=Apple",</w:t>
+        <w:t xml:space="preserve">      picture: "",</w:t>
       </w:r>
     </w:p>
     <w:p>
@@ -123,13 +122,13 @@
     </w:p>
     <w:p>
       <w:r>
+        <w:t xml:space="preserve">      price: 4.5,</w:t>
+      </w:r>
+    </w:p>
+    <w:p>
+      <w:r>
         <w:lastRenderedPageBreak/>
-        <w:t xml:space="preserve">      price: 4.5,</w:t>
-      </w:r>
-    </w:p>
-    <w:p>
-      <w:r>
-        <w:t xml:space="preserve">      picture: "https://via.placeholder.com/100?text=Milk",</w:t>
+        <w:t xml:space="preserve">      picture: "",</w:t>
       </w:r>
     </w:p>
     <w:p>
@@ -159,7 +158,7 @@
     </w:p>
     <w:p>
       <w:r>
-        <w:t xml:space="preserve">      picture: "https://via.placeholder.com/100?text=Bread",</w:t>
+        <w:t xml:space="preserve">      picture: "",</w:t>
       </w:r>
     </w:p>
     <w:p>
@@ -175,33 +174,12 @@
     <w:p/>
     <w:p>
       <w:r>
-        <w:t xml:space="preserve">  // New shopping list state</w:t>
-      </w:r>
-    </w:p>
-    <w:p>
-      <w:r>
         <w:t xml:space="preserve">  const [shoppingList, setShoppingList] = useState&lt;Product[]&gt;([]);</w:t>
       </w:r>
     </w:p>
     <w:p/>
     <w:p>
       <w:r>
-        <w:t xml:space="preserve">  const [newName, setNewName] = useState("");</w:t>
-      </w:r>
-    </w:p>
-    <w:p>
-      <w:r>
-        <w:t xml:space="preserve">  const [newPrice, setNewPrice] = useState("");</w:t>
-      </w:r>
-    </w:p>
-    <w:p>
-      <w:r>
-        <w:t xml:space="preserve">  const [newPicture, setNewPicture] = useState("");</w:t>
-      </w:r>
-    </w:p>
-    <w:p/>
-    <w:p>
-      <w:r>
         <w:t xml:space="preserve">  function handleOnClick() {</w:t>
       </w:r>
     </w:p>
@@ -218,122 +196,54 @@
     <w:p/>
     <w:p>
       <w:r>
-        <w:t xml:space="preserve">  function handleAddProduct() {</w:t>
-      </w:r>
-    </w:p>
-    <w:p>
-      <w:r>
-        <w:t xml:space="preserve">    if (</w:t>
-      </w:r>
-    </w:p>
-    <w:p>
-      <w:r>
-        <w:t xml:space="preserve">      newName.trim() === "" ||</w:t>
-      </w:r>
-    </w:p>
-    <w:p>
-      <w:r>
-        <w:t xml:space="preserve">      newPrice.trim() === "" ||</w:t>
-      </w:r>
-    </w:p>
-    <w:p>
-      <w:r>
-        <w:t xml:space="preserve">      newPicture.trim() === ""</w:t>
-      </w:r>
-    </w:p>
+        <w:t xml:space="preserve">  function handleAddToList(product: Product) {</w:t>
+      </w:r>
+    </w:p>
+    <w:p>
+      <w:r>
+        <w:t xml:space="preserve">    setShoppingList([...shoppingList, product]);</w:t>
+      </w:r>
+    </w:p>
+    <w:p>
+      <w:r>
+        <w:t xml:space="preserve">  }</w:t>
+      </w:r>
+    </w:p>
+    <w:p/>
+    <w:p>
+      <w:r>
+        <w:t xml:space="preserve">  // Delete item from shopping list</w:t>
+      </w:r>
+    </w:p>
+    <w:p>
+      <w:r>
+        <w:t xml:space="preserve">  function handleDeleteItem(id: number) {</w:t>
+      </w:r>
+    </w:p>
+    <w:p>
+      <w:r>
+        <w:t xml:space="preserve">    setShoppingList(</w:t>
+      </w:r>
+    </w:p>
+    <w:p>
+      <w:r>
+        <w:t xml:space="preserve">      shoppingList.filter((product) =&gt; product.id !== id)</w:t>
+      </w:r>
+    </w:p>
+    <w:p>
+      <w:r>
+        <w:t xml:space="preserve">    );</w:t>
+      </w:r>
+    </w:p>
+    <w:p>
+      <w:r>
+        <w:t xml:space="preserve">  }</w:t>
+      </w:r>
+    </w:p>
+    <w:p/>
     <w:p>
       <w:r>
         <w:lastRenderedPageBreak/>
-        <w:t xml:space="preserve">    )</w:t>
-      </w:r>
-    </w:p>
-    <w:p>
-      <w:r>
-        <w:t xml:space="preserve">      return;</w:t>
-      </w:r>
-    </w:p>
-    <w:p/>
-    <w:p>
-      <w:r>
-        <w:t xml:space="preserve">    const newProduct: Product = {</w:t>
-      </w:r>
-    </w:p>
-    <w:p>
-      <w:r>
-        <w:t xml:space="preserve">      id: products.length ? products[products.length - 1].id + 1 : 1,</w:t>
-      </w:r>
-    </w:p>
-    <w:p>
-      <w:r>
-        <w:t xml:space="preserve">      name: newName,</w:t>
-      </w:r>
-    </w:p>
-    <w:p>
-      <w:r>
-        <w:t xml:space="preserve">      price: Number(newPrice),</w:t>
-      </w:r>
-    </w:p>
-    <w:p>
-      <w:r>
-        <w:t xml:space="preserve">      picture: newPicture,</w:t>
-      </w:r>
-    </w:p>
-    <w:p>
-      <w:r>
-        <w:t xml:space="preserve">    };</w:t>
-      </w:r>
-    </w:p>
-    <w:p/>
-    <w:p>
-      <w:r>
-        <w:t xml:space="preserve">    setProducts([...products, newProduct]);</w:t>
-      </w:r>
-    </w:p>
-    <w:p/>
-    <w:p>
-      <w:r>
-        <w:t xml:space="preserve">    setNewName("");</w:t>
-      </w:r>
-    </w:p>
-    <w:p>
-      <w:r>
-        <w:t xml:space="preserve">    setNewPrice("");</w:t>
-      </w:r>
-    </w:p>
-    <w:p>
-      <w:r>
-        <w:t xml:space="preserve">    setNewPicture("");</w:t>
-      </w:r>
-    </w:p>
-    <w:p>
-      <w:r>
-        <w:t xml:space="preserve">  }</w:t>
-      </w:r>
-    </w:p>
-    <w:p/>
-    <w:p>
-      <w:r>
-        <w:t xml:space="preserve">  // Add item to shopping list</w:t>
-      </w:r>
-    </w:p>
-    <w:p>
-      <w:r>
-        <w:t xml:space="preserve">  function handleAddToList(product: Product) {</w:t>
-      </w:r>
-    </w:p>
-    <w:p>
-      <w:r>
-        <w:t xml:space="preserve">    setShoppingList([...shoppingList, product]);</w:t>
-      </w:r>
-    </w:p>
-    <w:p>
-      <w:r>
-        <w:t xml:space="preserve">  }</w:t>
-      </w:r>
-    </w:p>
-    <w:p/>
-    <w:p>
-      <w:r>
         <w:t xml:space="preserve">  return (</w:t>
       </w:r>
     </w:p>
@@ -349,45 +259,124 @@
     </w:p>
     <w:p>
       <w:r>
-        <w:t xml:space="preserve">        &lt;h3&gt;Shopping list&lt;/h3&gt;</w:t>
+        <w:t xml:space="preserve">        &lt;h3&gt;All Products&lt;/h3&gt;</w:t>
+      </w:r>
+    </w:p>
+    <w:p/>
+    <w:p>
+      <w:r>
+        <w:t xml:space="preserve">        &lt;SearchItem setSearch={setSearch} /&gt;</w:t>
+      </w:r>
+    </w:p>
+    <w:p/>
+    <w:p>
+      <w:r>
+        <w:t xml:space="preserve">        &lt;div&gt;</w:t>
+      </w:r>
+    </w:p>
+    <w:p>
+      <w:r>
+        <w:t xml:space="preserve">          {products</w:t>
+      </w:r>
+    </w:p>
+    <w:p>
+      <w:r>
+        <w:t xml:space="preserve">            .filter((product) =&gt;</w:t>
+      </w:r>
+    </w:p>
+    <w:p>
+      <w:r>
+        <w:t xml:space="preserve">              product.name.toLowerCase().includes(search.toLowerCase())</w:t>
+      </w:r>
+    </w:p>
+    <w:p>
+      <w:r>
+        <w:t xml:space="preserve">            )</w:t>
+      </w:r>
+    </w:p>
+    <w:p>
+      <w:r>
+        <w:t xml:space="preserve">            .map((product) =&gt; (</w:t>
+      </w:r>
+    </w:p>
+    <w:p>
+      <w:r>
+        <w:t xml:space="preserve">              &lt;div className="item" key={product.id}&gt;</w:t>
+      </w:r>
+    </w:p>
+    <w:p>
+      <w:r>
+        <w:t xml:space="preserve">                &lt;h4&gt;{product.name}&lt;/h4&gt;</w:t>
+      </w:r>
+    </w:p>
+    <w:p/>
+    <w:p>
+      <w:r>
+        <w:t xml:space="preserve">                &lt;p&gt;${product.price}&lt;/p&gt;</w:t>
+      </w:r>
+    </w:p>
+    <w:p/>
+    <w:p>
+      <w:r>
+        <w:t xml:space="preserve">                &lt;button onClick={() =&gt; handleAddToList(product)}&gt;</w:t>
+      </w:r>
+    </w:p>
+    <w:p>
+      <w:r>
+        <w:t xml:space="preserve">                  Add to the shopping list</w:t>
+      </w:r>
+    </w:p>
+    <w:p>
+      <w:r>
+        <w:t xml:space="preserve">                &lt;/button&gt;</w:t>
+      </w:r>
+    </w:p>
+    <w:p>
+      <w:r>
+        <w:t xml:space="preserve">              &lt;/div&gt;</w:t>
+      </w:r>
+    </w:p>
+    <w:p>
+      <w:r>
+        <w:t xml:space="preserve">            ))}</w:t>
+      </w:r>
+    </w:p>
+    <w:p>
+      <w:r>
+        <w:t xml:space="preserve">        &lt;/div&gt;</w:t>
+      </w:r>
+    </w:p>
+    <w:p/>
+    <w:p>
+      <w:r>
+        <w:t xml:space="preserve">        &lt;h4&gt;New Shopping List&lt;/h4&gt;</w:t>
       </w:r>
     </w:p>
     <w:p/>
     <w:p>
       <w:r>
         <w:lastRenderedPageBreak/>
-        <w:t xml:space="preserve">        &lt;SearchItem setSearch={setSearch} /&gt;</w:t>
-      </w:r>
-    </w:p>
-    <w:p/>
-    <w:p>
-      <w:r>
         <w:t xml:space="preserve">        &lt;div&gt;</w:t>
       </w:r>
     </w:p>
     <w:p>
       <w:r>
-        <w:t xml:space="preserve">          {products</w:t>
-      </w:r>
-    </w:p>
-    <w:p>
-      <w:r>
-        <w:t xml:space="preserve">            .filter((product) =&gt;</w:t>
-      </w:r>
-    </w:p>
-    <w:p>
-      <w:r>
-        <w:t xml:space="preserve">              product.name.toLowerCase().includes(search.toLowerCase())</w:t>
-      </w:r>
-    </w:p>
-    <w:p>
-      <w:r>
-        <w:t xml:space="preserve">            )</w:t>
-      </w:r>
-    </w:p>
-    <w:p>
-      <w:r>
-        <w:t xml:space="preserve">            .map((product) =&gt; (</w:t>
+        <w:t xml:space="preserve">          {shoppingList.length === 0 ? (</w:t>
+      </w:r>
+    </w:p>
+    <w:p>
+      <w:r>
+        <w:t xml:space="preserve">            &lt;p&gt;You don't have anything in your shopping list yet.&lt;/p&gt;</w:t>
+      </w:r>
+    </w:p>
+    <w:p>
+      <w:r>
+        <w:t xml:space="preserve">          ) : (</w:t>
+      </w:r>
+    </w:p>
+    <w:p>
+      <w:r>
+        <w:t xml:space="preserve">            shoppingList.map((product) =&gt; (</w:t>
       </w:r>
     </w:p>
     <w:p>
@@ -397,12 +386,6 @@
     </w:p>
     <w:p>
       <w:r>
-        <w:t xml:space="preserve">                &lt;img src={product.picture} alt={product.name} width="100" /&gt;</w:t>
-      </w:r>
-    </w:p>
-    <w:p/>
-    <w:p>
-      <w:r>
         <w:t xml:space="preserve">                &lt;h4&gt;{product.name}&lt;/h4&gt;</w:t>
       </w:r>
     </w:p>
@@ -415,12 +398,12 @@
     <w:p/>
     <w:p>
       <w:r>
-        <w:t xml:space="preserve">                &lt;button onClick={() =&gt; handleAddToList(product)}&gt;</w:t>
-      </w:r>
-    </w:p>
-    <w:p>
-      <w:r>
-        <w:t xml:space="preserve">                  Add to list</w:t>
+        <w:t xml:space="preserve">                &lt;button onClick={() =&gt; handleDeleteItem(product.id)}&gt;</w:t>
+      </w:r>
+    </w:p>
+    <w:p>
+      <w:r>
+        <w:t xml:space="preserve">                  Delete</w:t>
       </w:r>
     </w:p>
     <w:p>
@@ -435,235 +418,17 @@
     </w:p>
     <w:p>
       <w:r>
-        <w:t xml:space="preserve">            ))}</w:t>
+        <w:t xml:space="preserve">            ))</w:t>
+      </w:r>
+    </w:p>
+    <w:p>
+      <w:r>
+        <w:t xml:space="preserve">          )}</w:t>
       </w:r>
     </w:p>
     <w:p>
       <w:r>
         <w:t xml:space="preserve">        &lt;/div&gt;</w:t>
-      </w:r>
-    </w:p>
-    <w:p/>
-    <w:p>
-      <w:r>
-        <w:t xml:space="preserve">        &lt;h4&gt;Add new product&lt;/h4&gt;</w:t>
-      </w:r>
-    </w:p>
-    <w:p/>
-    <w:p>
-      <w:r>
-        <w:t xml:space="preserve">        &lt;input</w:t>
-      </w:r>
-    </w:p>
-    <w:p>
-      <w:r>
-        <w:t xml:space="preserve">          type="text"</w:t>
-      </w:r>
-    </w:p>
-    <w:p>
-      <w:r>
-        <w:t xml:space="preserve">          placeholder="Product name"</w:t>
-      </w:r>
-    </w:p>
-    <w:p>
-      <w:r>
-        <w:lastRenderedPageBreak/>
-        <w:t xml:space="preserve">          value={newName}</w:t>
-      </w:r>
-    </w:p>
-    <w:p>
-      <w:r>
-        <w:t xml:space="preserve">          onChange={(e) =&gt; setNewName(e.target.value)}</w:t>
-      </w:r>
-    </w:p>
-    <w:p>
-      <w:r>
-        <w:t xml:space="preserve">        /&gt;</w:t>
-      </w:r>
-    </w:p>
-    <w:p/>
-    <w:p>
-      <w:r>
-        <w:t xml:space="preserve">        &lt;input</w:t>
-      </w:r>
-    </w:p>
-    <w:p>
-      <w:r>
-        <w:t xml:space="preserve">          type="number"</w:t>
-      </w:r>
-    </w:p>
-    <w:p>
-      <w:r>
-        <w:t xml:space="preserve">          placeholder="Price"</w:t>
-      </w:r>
-    </w:p>
-    <w:p>
-      <w:r>
-        <w:t xml:space="preserve">          value={newPrice}</w:t>
-      </w:r>
-    </w:p>
-    <w:p>
-      <w:r>
-        <w:t xml:space="preserve">          onChange={(e) =&gt; setNewPrice(e.target.value)}</w:t>
-      </w:r>
-    </w:p>
-    <w:p>
-      <w:r>
-        <w:t xml:space="preserve">        /&gt;</w:t>
-      </w:r>
-    </w:p>
-    <w:p/>
-    <w:p>
-      <w:r>
-        <w:t xml:space="preserve">        &lt;input</w:t>
-      </w:r>
-    </w:p>
-    <w:p>
-      <w:r>
-        <w:t xml:space="preserve">          type="text"</w:t>
-      </w:r>
-    </w:p>
-    <w:p>
-      <w:r>
-        <w:t xml:space="preserve">          placeholder="Picture URL"</w:t>
-      </w:r>
-    </w:p>
-    <w:p>
-      <w:r>
-        <w:t xml:space="preserve">          value={newPicture}</w:t>
-      </w:r>
-    </w:p>
-    <w:p>
-      <w:r>
-        <w:t xml:space="preserve">          onChange={(e) =&gt; setNewPicture(e.target.value)}</w:t>
-      </w:r>
-    </w:p>
-    <w:p>
-      <w:r>
-        <w:t xml:space="preserve">        /&gt;</w:t>
-      </w:r>
-    </w:p>
-    <w:p/>
-    <w:p>
-      <w:r>
-        <w:t xml:space="preserve">        &lt;button onClick={handleAddProduct}&gt;Add Product&lt;/button&gt;</w:t>
-      </w:r>
-    </w:p>
-    <w:p/>
-    <w:p>
-      <w:r>
-        <w:t xml:space="preserve">        &lt;br /&gt;</w:t>
-      </w:r>
-    </w:p>
-    <w:p>
-      <w:r>
-        <w:t xml:space="preserve">        &lt;br /&gt;</w:t>
-      </w:r>
-    </w:p>
-    <w:p/>
-    <w:p>
-      <w:r>
-        <w:t xml:space="preserve">        {/* New Shopping List Section */}</w:t>
-      </w:r>
-    </w:p>
-    <w:p>
-      <w:r>
-        <w:t xml:space="preserve">        &lt;h4&gt;My List&lt;/h4&gt;</w:t>
-      </w:r>
-    </w:p>
-    <w:p/>
-    <w:p>
-      <w:r>
-        <w:t xml:space="preserve">        &lt;div&gt;</w:t>
-      </w:r>
-    </w:p>
-    <w:p>
-      <w:r>
-        <w:lastRenderedPageBreak/>
-        <w:t xml:space="preserve">          {shoppingList.length === 0 ? (</w:t>
-      </w:r>
-    </w:p>
-    <w:p>
-      <w:r>
-        <w:t xml:space="preserve">            &lt;p&gt;No items added yet.&lt;/p&gt;</w:t>
-      </w:r>
-    </w:p>
-    <w:p>
-      <w:r>
-        <w:t xml:space="preserve">          ) : (</w:t>
-      </w:r>
-    </w:p>
-    <w:p>
-      <w:r>
-        <w:t xml:space="preserve">            shoppingList.map((product, index) =&gt; (</w:t>
-      </w:r>
-    </w:p>
-    <w:p>
-      <w:r>
-        <w:t xml:space="preserve">              &lt;div className="item" key={`${product.id}-${index}`}&gt;</w:t>
-      </w:r>
-    </w:p>
-    <w:p>
-      <w:r>
-        <w:t xml:space="preserve">                &lt;img</w:t>
-      </w:r>
-    </w:p>
-    <w:p>
-      <w:r>
-        <w:t xml:space="preserve">                  src={product.picture}</w:t>
-      </w:r>
-    </w:p>
-    <w:p>
-      <w:r>
-        <w:t xml:space="preserve">                  alt={product.name}</w:t>
-      </w:r>
-    </w:p>
-    <w:p>
-      <w:r>
-        <w:t xml:space="preserve">                  width="100"</w:t>
-      </w:r>
-    </w:p>
-    <w:p>
-      <w:r>
-        <w:t xml:space="preserve">                /&gt;</w:t>
-      </w:r>
-    </w:p>
-    <w:p/>
-    <w:p>
-      <w:r>
-        <w:t xml:space="preserve">                &lt;h4&gt;{product.name}&lt;/h4&gt;</w:t>
-      </w:r>
-    </w:p>
-    <w:p/>
-    <w:p>
-      <w:r>
-        <w:t xml:space="preserve">                &lt;p&gt;${product.price}&lt;/p&gt;</w:t>
-      </w:r>
-    </w:p>
-    <w:p>
-      <w:r>
-        <w:t xml:space="preserve">              &lt;/div&gt;</w:t>
-      </w:r>
-    </w:p>
-    <w:p>
-      <w:r>
-        <w:t xml:space="preserve">            ))</w:t>
-      </w:r>
-    </w:p>
-    <w:p>
-      <w:r>
-        <w:t xml:space="preserve">          )}</w:t>
-      </w:r>
-    </w:p>
-    <w:p>
-      <w:r>
-        <w:t xml:space="preserve">        &lt;/div&gt;</w:t>
-      </w:r>
-    </w:p>
-    <w:p/>
-    <w:p>
-      <w:r>
-        <w:t xml:space="preserve">        &lt;br /&gt;</w:t>
       </w:r>
     </w:p>
     <w:p/>

</xml_diff>

<commit_message>
add images to the item
</commit_message>
<xml_diff>
--- a/import PageTemplate from.docx
+++ b/import PageTemplate from.docx
@@ -19,7 +19,7 @@
     </w:p>
     <w:p>
       <w:r>
-        <w:t>import { useState } from "react";</w:t>
+        <w:t>import { useEffect, useState } from "react";</w:t>
       </w:r>
     </w:p>
     <w:p/>
@@ -56,6 +56,27 @@
     <w:p/>
     <w:p>
       <w:r>
+        <w:t>type ShoppingItem = {</w:t>
+      </w:r>
+    </w:p>
+    <w:p>
+      <w:r>
+        <w:t xml:space="preserve">  id: string;</w:t>
+      </w:r>
+    </w:p>
+    <w:p>
+      <w:r>
+        <w:t xml:space="preserve">  item: Product;</w:t>
+      </w:r>
+    </w:p>
+    <w:p>
+      <w:r>
+        <w:t>};</w:t>
+      </w:r>
+    </w:p>
+    <w:p/>
+    <w:p>
+      <w:r>
         <w:t>export default function Secondpage() {</w:t>
       </w:r>
     </w:p>
@@ -102,6 +123,7 @@
     </w:p>
     <w:p>
       <w:r>
+        <w:lastRenderedPageBreak/>
         <w:t xml:space="preserve">    },</w:t>
       </w:r>
     </w:p>
@@ -127,203 +149,342 @@
     </w:p>
     <w:p>
       <w:r>
+        <w:t xml:space="preserve">      picture: "",</w:t>
+      </w:r>
+    </w:p>
+    <w:p>
+      <w:r>
+        <w:t xml:space="preserve">    },</w:t>
+      </w:r>
+    </w:p>
+    <w:p>
+      <w:r>
+        <w:t xml:space="preserve">    {</w:t>
+      </w:r>
+    </w:p>
+    <w:p>
+      <w:r>
+        <w:t xml:space="preserve">      id: 3,</w:t>
+      </w:r>
+    </w:p>
+    <w:p>
+      <w:r>
+        <w:t xml:space="preserve">      name: "Bread",</w:t>
+      </w:r>
+    </w:p>
+    <w:p>
+      <w:r>
+        <w:t xml:space="preserve">      price: 3.25,</w:t>
+      </w:r>
+    </w:p>
+    <w:p>
+      <w:r>
+        <w:t xml:space="preserve">      picture: "",</w:t>
+      </w:r>
+    </w:p>
+    <w:p>
+      <w:r>
+        <w:t xml:space="preserve">    },</w:t>
+      </w:r>
+    </w:p>
+    <w:p>
+      <w:r>
+        <w:t xml:space="preserve">  ]);</w:t>
+      </w:r>
+    </w:p>
+    <w:p/>
+    <w:p>
+      <w:r>
+        <w:t xml:space="preserve">  const [shoppingList, setShoppingList] = useState&lt;ShoppingItem[]&gt;(() =&gt; {</w:t>
+      </w:r>
+    </w:p>
+    <w:p>
+      <w:r>
+        <w:t xml:space="preserve">    const savedList = localStorage.getItem("shoppingList");</w:t>
+      </w:r>
+    </w:p>
+    <w:p>
+      <w:r>
+        <w:t xml:space="preserve">    return savedList ? JSON.parse(savedList) : [];</w:t>
+      </w:r>
+    </w:p>
+    <w:p>
+      <w:r>
+        <w:t xml:space="preserve">  });</w:t>
+      </w:r>
+    </w:p>
+    <w:p/>
+    <w:p>
+      <w:r>
+        <w:t xml:space="preserve">  useEffect(() =&gt; {</w:t>
+      </w:r>
+    </w:p>
+    <w:p>
+      <w:r>
+        <w:t xml:space="preserve">    localStorage.setItem("shoppingList", JSON.stringify(shoppingList));</w:t>
+      </w:r>
+    </w:p>
+    <w:p>
+      <w:r>
+        <w:t xml:space="preserve">  }, [shoppingList]);</w:t>
+      </w:r>
+    </w:p>
+    <w:p/>
+    <w:p>
+      <w:r>
+        <w:t xml:space="preserve">  function handleOnClick() {</w:t>
+      </w:r>
+    </w:p>
+    <w:p>
+      <w:r>
+        <w:t xml:space="preserve">    navigate("/first-page");</w:t>
+      </w:r>
+    </w:p>
+    <w:p>
+      <w:r>
+        <w:t xml:space="preserve">  }</w:t>
+      </w:r>
+    </w:p>
+    <w:p/>
+    <w:p>
+      <w:r>
+        <w:t xml:space="preserve">  function handAddToList(product: Product) {</w:t>
+      </w:r>
+    </w:p>
+    <w:p>
+      <w:r>
+        <w:t xml:space="preserve">    setShoppingList([</w:t>
+      </w:r>
+    </w:p>
+    <w:p>
+      <w:r>
+        <w:t xml:space="preserve">      ...shoppingList,</w:t>
+      </w:r>
+    </w:p>
+    <w:p>
+      <w:r>
+        <w:t xml:space="preserve">      {</w:t>
+      </w:r>
+    </w:p>
+    <w:p>
+      <w:r>
+        <w:t xml:space="preserve">        id: crypto.randomUUID(),</w:t>
+      </w:r>
+    </w:p>
+    <w:p>
+      <w:r>
+        <w:t xml:space="preserve">        item: product,</w:t>
+      </w:r>
+    </w:p>
+    <w:p>
+      <w:r>
+        <w:t xml:space="preserve">      },</w:t>
+      </w:r>
+    </w:p>
+    <w:p>
+      <w:r>
+        <w:t xml:space="preserve">    ]);</w:t>
+      </w:r>
+    </w:p>
+    <w:p>
+      <w:r>
+        <w:t xml:space="preserve">  }</w:t>
+      </w:r>
+    </w:p>
+    <w:p/>
+    <w:p>
+      <w:r>
+        <w:t xml:space="preserve">  function handleDeleteItem(id: string) {</w:t>
+      </w:r>
+    </w:p>
+    <w:p>
+      <w:r>
+        <w:t xml:space="preserve">    setShoppingList(shoppingList.filter((item) =&gt; item.id !== id));</w:t>
+      </w:r>
+    </w:p>
+    <w:p>
+      <w:r>
+        <w:t xml:space="preserve">  }</w:t>
+      </w:r>
+    </w:p>
+    <w:p/>
+    <w:p>
+      <w:r>
+        <w:t xml:space="preserve">  function handleGoToShoppingList() {</w:t>
+      </w:r>
+    </w:p>
+    <w:p>
+      <w:r>
+        <w:t xml:space="preserve">    navigate("/shopping-Page", { state: { shoppingList } });</w:t>
+      </w:r>
+    </w:p>
+    <w:p>
+      <w:r>
+        <w:t xml:space="preserve">  }</w:t>
+      </w:r>
+    </w:p>
+    <w:p/>
+    <w:p>
+      <w:r>
+        <w:t xml:space="preserve">  return (</w:t>
+      </w:r>
+    </w:p>
+    <w:p>
+      <w:r>
+        <w:t xml:space="preserve">    &lt;PageTemplate&gt;</w:t>
+      </w:r>
+    </w:p>
+    <w:p>
+      <w:r>
+        <w:t xml:space="preserve">      &lt;div className="div"&gt;</w:t>
+      </w:r>
+    </w:p>
+    <w:p>
+      <w:r>
+        <w:t xml:space="preserve">        &lt;h3&gt;All Products&lt;/h3&gt;</w:t>
+      </w:r>
+    </w:p>
+    <w:p/>
+    <w:p>
+      <w:r>
+        <w:t xml:space="preserve">        &lt;SearchItem setSearch={setSearch} /&gt;</w:t>
+      </w:r>
+    </w:p>
+    <w:p/>
+    <w:p>
+      <w:r>
+        <w:t xml:space="preserve">        &lt;div&gt;</w:t>
+      </w:r>
+    </w:p>
+    <w:p>
+      <w:r>
         <w:lastRenderedPageBreak/>
-        <w:t xml:space="preserve">      picture: "",</w:t>
-      </w:r>
-    </w:p>
-    <w:p>
-      <w:r>
-        <w:t xml:space="preserve">    },</w:t>
-      </w:r>
-    </w:p>
-    <w:p>
-      <w:r>
-        <w:t xml:space="preserve">    {</w:t>
-      </w:r>
-    </w:p>
-    <w:p>
-      <w:r>
-        <w:t xml:space="preserve">      id: 3,</w:t>
-      </w:r>
-    </w:p>
-    <w:p>
-      <w:r>
-        <w:t xml:space="preserve">      name: "Bread",</w:t>
-      </w:r>
-    </w:p>
-    <w:p>
-      <w:r>
-        <w:t xml:space="preserve">      price: 3.25,</w:t>
-      </w:r>
-    </w:p>
-    <w:p>
-      <w:r>
-        <w:t xml:space="preserve">      picture: "",</w:t>
-      </w:r>
-    </w:p>
-    <w:p>
-      <w:r>
-        <w:t xml:space="preserve">    },</w:t>
-      </w:r>
-    </w:p>
-    <w:p>
-      <w:r>
-        <w:t xml:space="preserve">  ]);</w:t>
-      </w:r>
-    </w:p>
-    <w:p/>
-    <w:p>
-      <w:r>
-        <w:t xml:space="preserve">  const [shoppingList, setShoppingList] = useState&lt;Product[]&gt;([]);</w:t>
-      </w:r>
-    </w:p>
-    <w:p/>
-    <w:p>
-      <w:r>
-        <w:t xml:space="preserve">  function handleOnClick() {</w:t>
-      </w:r>
-    </w:p>
-    <w:p>
-      <w:r>
-        <w:t xml:space="preserve">    navigate("/first-page");</w:t>
-      </w:r>
-    </w:p>
-    <w:p>
-      <w:r>
-        <w:t xml:space="preserve">  }</w:t>
-      </w:r>
-    </w:p>
-    <w:p/>
-    <w:p>
-      <w:r>
-        <w:t xml:space="preserve">  function handleAddToList(product: Product) {</w:t>
-      </w:r>
-    </w:p>
-    <w:p>
-      <w:r>
-        <w:t xml:space="preserve">    setShoppingList([...shoppingList, product]);</w:t>
-      </w:r>
-    </w:p>
-    <w:p>
-      <w:r>
-        <w:t xml:space="preserve">  }</w:t>
-      </w:r>
-    </w:p>
-    <w:p/>
-    <w:p>
-      <w:r>
-        <w:t xml:space="preserve">  // Delete item from shopping list</w:t>
-      </w:r>
-    </w:p>
-    <w:p>
-      <w:r>
-        <w:t xml:space="preserve">  function handleDeleteItem(id: number) {</w:t>
-      </w:r>
-    </w:p>
-    <w:p>
-      <w:r>
-        <w:t xml:space="preserve">    setShoppingList(</w:t>
-      </w:r>
-    </w:p>
-    <w:p>
-      <w:r>
-        <w:t xml:space="preserve">      shoppingList.filter((product) =&gt; product.id !== id)</w:t>
-      </w:r>
-    </w:p>
-    <w:p>
-      <w:r>
-        <w:t xml:space="preserve">    );</w:t>
-      </w:r>
-    </w:p>
-    <w:p>
-      <w:r>
-        <w:t xml:space="preserve">  }</w:t>
+        <w:t xml:space="preserve">          {products</w:t>
+      </w:r>
+    </w:p>
+    <w:p>
+      <w:r>
+        <w:t xml:space="preserve">            .filter((product) =&gt;</w:t>
+      </w:r>
+    </w:p>
+    <w:p>
+      <w:r>
+        <w:t xml:space="preserve">              product.name.toLowerCase().includes(search.toLowerCase())</w:t>
+      </w:r>
+    </w:p>
+    <w:p>
+      <w:r>
+        <w:t xml:space="preserve">            )</w:t>
+      </w:r>
+    </w:p>
+    <w:p>
+      <w:r>
+        <w:t xml:space="preserve">            .map((product) =&gt; (</w:t>
+      </w:r>
+    </w:p>
+    <w:p>
+      <w:r>
+        <w:t xml:space="preserve">              &lt;div className="item" key={product.id}&gt;</w:t>
+      </w:r>
+    </w:p>
+    <w:p>
+      <w:r>
+        <w:t xml:space="preserve">                &lt;h4&gt;{product.name}&lt;/h4&gt;</w:t>
+      </w:r>
+    </w:p>
+    <w:p>
+      <w:r>
+        <w:t xml:space="preserve">                &lt;p&gt;${product.price}&lt;/p&gt;</w:t>
+      </w:r>
+    </w:p>
+    <w:p/>
+    <w:p>
+      <w:r>
+        <w:t xml:space="preserve">                &lt;button onClick={() =&gt; handAddToList(product)}&gt;</w:t>
+      </w:r>
+    </w:p>
+    <w:p>
+      <w:r>
+        <w:t xml:space="preserve">                  Add to the shopping list</w:t>
+      </w:r>
+    </w:p>
+    <w:p>
+      <w:r>
+        <w:t xml:space="preserve">                &lt;/button&gt;</w:t>
+      </w:r>
+    </w:p>
+    <w:p>
+      <w:r>
+        <w:t xml:space="preserve">              &lt;/div&gt;</w:t>
+      </w:r>
+    </w:p>
+    <w:p>
+      <w:r>
+        <w:t xml:space="preserve">            ))}</w:t>
+      </w:r>
+    </w:p>
+    <w:p>
+      <w:r>
+        <w:t xml:space="preserve">        &lt;/div&gt;</w:t>
+      </w:r>
+    </w:p>
+    <w:p/>
+    <w:p>
+      <w:r>
+        <w:t xml:space="preserve">        &lt;h4&gt;New Shopping List&lt;/h4&gt;</w:t>
+      </w:r>
+    </w:p>
+    <w:p/>
+    <w:p>
+      <w:r>
+        <w:t xml:space="preserve">        &lt;div&gt;</w:t>
+      </w:r>
+    </w:p>
+    <w:p>
+      <w:r>
+        <w:t xml:space="preserve">          {shoppingList.length === 0 ? (</w:t>
+      </w:r>
+    </w:p>
+    <w:p>
+      <w:r>
+        <w:t xml:space="preserve">            &lt;p&gt;You dont have anything in your shopping list yet&lt;/p&gt;</w:t>
+      </w:r>
+    </w:p>
+    <w:p>
+      <w:r>
+        <w:t xml:space="preserve">          ) : (</w:t>
+      </w:r>
+    </w:p>
+    <w:p>
+      <w:r>
+        <w:t xml:space="preserve">            shoppingList.map((item) =&gt; (</w:t>
+      </w:r>
+    </w:p>
+    <w:p>
+      <w:r>
+        <w:t xml:space="preserve">              &lt;div className="item" key={item.id}&gt;</w:t>
+      </w:r>
+    </w:p>
+    <w:p>
+      <w:r>
+        <w:t xml:space="preserve">                &lt;h4&gt;{item.item.name}&lt;/h4&gt;</w:t>
+      </w:r>
+    </w:p>
+    <w:p>
+      <w:r>
+        <w:t xml:space="preserve">                &lt;p&gt;${item.item.price}&lt;/p&gt;</w:t>
       </w:r>
     </w:p>
     <w:p/>
     <w:p>
       <w:r>
         <w:lastRenderedPageBreak/>
-        <w:t xml:space="preserve">  return (</w:t>
-      </w:r>
-    </w:p>
-    <w:p>
-      <w:r>
-        <w:t xml:space="preserve">    &lt;PageTemplate&gt;</w:t>
-      </w:r>
-    </w:p>
-    <w:p>
-      <w:r>
-        <w:t xml:space="preserve">      &lt;div className="div"&gt;</w:t>
-      </w:r>
-    </w:p>
-    <w:p>
-      <w:r>
-        <w:t xml:space="preserve">        &lt;h3&gt;All Products&lt;/h3&gt;</w:t>
-      </w:r>
-    </w:p>
-    <w:p/>
-    <w:p>
-      <w:r>
-        <w:t xml:space="preserve">        &lt;SearchItem setSearch={setSearch} /&gt;</w:t>
-      </w:r>
-    </w:p>
-    <w:p/>
-    <w:p>
-      <w:r>
-        <w:t xml:space="preserve">        &lt;div&gt;</w:t>
-      </w:r>
-    </w:p>
-    <w:p>
-      <w:r>
-        <w:t xml:space="preserve">          {products</w:t>
-      </w:r>
-    </w:p>
-    <w:p>
-      <w:r>
-        <w:t xml:space="preserve">            .filter((product) =&gt;</w:t>
-      </w:r>
-    </w:p>
-    <w:p>
-      <w:r>
-        <w:t xml:space="preserve">              product.name.toLowerCase().includes(search.toLowerCase())</w:t>
-      </w:r>
-    </w:p>
-    <w:p>
-      <w:r>
-        <w:t xml:space="preserve">            )</w:t>
-      </w:r>
-    </w:p>
-    <w:p>
-      <w:r>
-        <w:t xml:space="preserve">            .map((product) =&gt; (</w:t>
-      </w:r>
-    </w:p>
-    <w:p>
-      <w:r>
-        <w:t xml:space="preserve">              &lt;div className="item" key={product.id}&gt;</w:t>
-      </w:r>
-    </w:p>
-    <w:p>
-      <w:r>
-        <w:t xml:space="preserve">                &lt;h4&gt;{product.name}&lt;/h4&gt;</w:t>
-      </w:r>
-    </w:p>
-    <w:p/>
-    <w:p>
-      <w:r>
-        <w:t xml:space="preserve">                &lt;p&gt;${product.price}&lt;/p&gt;</w:t>
-      </w:r>
-    </w:p>
-    <w:p/>
-    <w:p>
-      <w:r>
-        <w:t xml:space="preserve">                &lt;button onClick={() =&gt; handleAddToList(product)}&gt;</w:t>
-      </w:r>
-    </w:p>
-    <w:p>
-      <w:r>
-        <w:t xml:space="preserve">                  Add to the shopping list</w:t>
+        <w:t xml:space="preserve">                &lt;button onClick={() =&gt; handleDeleteItem(item.id)}&gt;</w:t>
+      </w:r>
+    </w:p>
+    <w:p>
+      <w:r>
+        <w:t xml:space="preserve">                  Delete</w:t>
       </w:r>
     </w:p>
     <w:p>
@@ -338,7 +499,12 @@
     </w:p>
     <w:p>
       <w:r>
-        <w:t xml:space="preserve">            ))}</w:t>
+        <w:t xml:space="preserve">            ))</w:t>
+      </w:r>
+    </w:p>
+    <w:p>
+      <w:r>
+        <w:t xml:space="preserve">          )}</w:t>
       </w:r>
     </w:p>
     <w:p>
@@ -349,86 +515,23 @@
     <w:p/>
     <w:p>
       <w:r>
-        <w:t xml:space="preserve">        &lt;h4&gt;New Shopping List&lt;/h4&gt;</w:t>
-      </w:r>
-    </w:p>
-    <w:p/>
-    <w:p>
-      <w:r>
-        <w:lastRenderedPageBreak/>
-        <w:t xml:space="preserve">        &lt;div&gt;</w:t>
-      </w:r>
-    </w:p>
-    <w:p>
-      <w:r>
-        <w:t xml:space="preserve">          {shoppingList.length === 0 ? (</w:t>
-      </w:r>
-    </w:p>
-    <w:p>
-      <w:r>
-        <w:t xml:space="preserve">            &lt;p&gt;You don't have anything in your shopping list yet.&lt;/p&gt;</w:t>
-      </w:r>
-    </w:p>
-    <w:p>
-      <w:r>
-        <w:t xml:space="preserve">          ) : (</w:t>
-      </w:r>
-    </w:p>
-    <w:p>
-      <w:r>
-        <w:t xml:space="preserve">            shoppingList.map((product) =&gt; (</w:t>
-      </w:r>
-    </w:p>
-    <w:p>
-      <w:r>
-        <w:t xml:space="preserve">              &lt;div className="item" key={product.id}&gt;</w:t>
-      </w:r>
-    </w:p>
-    <w:p>
-      <w:r>
-        <w:t xml:space="preserve">                &lt;h4&gt;{product.name}&lt;/h4&gt;</w:t>
-      </w:r>
-    </w:p>
-    <w:p/>
-    <w:p>
-      <w:r>
-        <w:t xml:space="preserve">                &lt;p&gt;${product.price}&lt;/p&gt;</w:t>
-      </w:r>
-    </w:p>
-    <w:p/>
-    <w:p>
-      <w:r>
-        <w:t xml:space="preserve">                &lt;button onClick={() =&gt; handleDeleteItem(product.id)}&gt;</w:t>
-      </w:r>
-    </w:p>
-    <w:p>
-      <w:r>
-        <w:t xml:space="preserve">                  Delete</w:t>
-      </w:r>
-    </w:p>
-    <w:p>
-      <w:r>
-        <w:t xml:space="preserve">                &lt;/button&gt;</w:t>
-      </w:r>
-    </w:p>
-    <w:p>
-      <w:r>
-        <w:t xml:space="preserve">              &lt;/div&gt;</w:t>
-      </w:r>
-    </w:p>
-    <w:p>
-      <w:r>
-        <w:t xml:space="preserve">            ))</w:t>
-      </w:r>
-    </w:p>
-    <w:p>
-      <w:r>
-        <w:t xml:space="preserve">          )}</w:t>
-      </w:r>
-    </w:p>
-    <w:p>
-      <w:r>
-        <w:t xml:space="preserve">        &lt;/div&gt;</w:t>
+        <w:t xml:space="preserve">        &lt;button onClick={handleGoToShoppingList}&gt;</w:t>
+      </w:r>
+    </w:p>
+    <w:p>
+      <w:r>
+        <w:t xml:space="preserve">          Go to Shopping List Page</w:t>
+      </w:r>
+    </w:p>
+    <w:p>
+      <w:r>
+        <w:t xml:space="preserve">        &lt;/button&gt;</w:t>
+      </w:r>
+    </w:p>
+    <w:p/>
+    <w:p>
+      <w:r>
+        <w:t xml:space="preserve">        &lt;br /&gt;</w:t>
       </w:r>
     </w:p>
     <w:p/>

</xml_diff>